<commit_message>
Add prototyping and assembly items to the component list
Two solderless breadboards, three jumper-wire sets (M-M, M-F, F-F) and
assorted DIP IC sockets, as a third section covering both boards.

Co-Authored-By: Claude <noreply@anthropic.com>
</commit_message>
<xml_diff>
--- a/PFUMA_Component_List.docx
+++ b/PFUMA_Component_List.docx
@@ -3727,6 +3727,638 @@
                 <w:szCs w:val="20"/>
               </w:rPr>
               <w:t xml:space="preserve">12 V, 1 A wall supply</w:t>
+            </w:r>
+          </w:p>
+        </w:tc>
+      </w:tr>
+    </w:tbl>
+    <w:p>
+      <w:pPr>
+        <w:pStyle w:val="Heading1"/>
+        <w:spacing w:after="140" w:before="320"/>
+      </w:pPr>
+      <w:r>
+        <w:rPr>
+          <w:rFonts w:ascii="Calibri" w:cs="Calibri" w:eastAsia="Calibri" w:hAnsi="Calibri"/>
+          <w:b/>
+          <w:bCs/>
+          <w:color w:val="000000"/>
+          <w:sz w:val="24"/>
+          <w:szCs w:val="24"/>
+        </w:rPr>
+        <w:t xml:space="preserve">Prototyping and Assembly</w:t>
+      </w:r>
+    </w:p>
+    <w:tbl>
+      <w:tblPr>
+        <w:tblW w:type="dxa" w:w="9604"/>
+        <w:tblBorders>
+          <w:top w:val="single" w:color="auto" w:sz="4"/>
+          <w:left w:val="single" w:color="auto" w:sz="4"/>
+          <w:bottom w:val="single" w:color="auto" w:sz="4"/>
+          <w:right w:val="single" w:color="auto" w:sz="4"/>
+          <w:insideH w:val="single" w:color="auto" w:sz="4"/>
+          <w:insideV w:val="single" w:color="auto" w:sz="4"/>
+        </w:tblBorders>
+      </w:tblPr>
+      <w:tblGrid>
+        <w:gridCol w:w="960"/>
+        <w:gridCol w:w="3842"/>
+        <w:gridCol w:w="4802"/>
+      </w:tblGrid>
+      <w:tr>
+        <w:trPr>
+          <w:tblHeader/>
+        </w:trPr>
+        <w:tc>
+          <w:tcPr>
+            <w:tcW w:type="dxa" w:w="960"/>
+            <w:tcBorders>
+              <w:top w:val="single" w:color="000000" w:sz="2"/>
+              <w:left w:val="single" w:color="000000" w:sz="2"/>
+              <w:bottom w:val="single" w:color="000000" w:sz="2"/>
+              <w:right w:val="single" w:color="000000" w:sz="2"/>
+            </w:tcBorders>
+            <w:shd w:fill="E6E6E6" w:color="auto" w:val="clear"/>
+            <w:tcMar>
+              <w:top w:type="dxa" w:w="80"/>
+              <w:left w:type="dxa" w:w="110"/>
+              <w:bottom w:type="dxa" w:w="80"/>
+              <w:right w:type="dxa" w:w="110"/>
+            </w:tcMar>
+          </w:tcPr>
+          <w:p>
+            <w:pPr>
+              <w:spacing w:after="0" w:line="240"/>
+            </w:pPr>
+            <w:r>
+              <w:rPr>
+                <w:rFonts w:ascii="Calibri" w:cs="Calibri" w:eastAsia="Calibri" w:hAnsi="Calibri"/>
+                <w:b/>
+                <w:bCs/>
+                <w:color w:val="000000"/>
+                <w:sz w:val="20"/>
+                <w:szCs w:val="20"/>
+              </w:rPr>
+              <w:t xml:space="preserve">Ref</w:t>
+            </w:r>
+          </w:p>
+        </w:tc>
+        <w:tc>
+          <w:tcPr>
+            <w:tcW w:type="dxa" w:w="3842"/>
+            <w:tcBorders>
+              <w:top w:val="single" w:color="000000" w:sz="2"/>
+              <w:left w:val="single" w:color="000000" w:sz="2"/>
+              <w:bottom w:val="single" w:color="000000" w:sz="2"/>
+              <w:right w:val="single" w:color="000000" w:sz="2"/>
+            </w:tcBorders>
+            <w:shd w:fill="E6E6E6" w:color="auto" w:val="clear"/>
+            <w:tcMar>
+              <w:top w:type="dxa" w:w="80"/>
+              <w:left w:type="dxa" w:w="110"/>
+              <w:bottom w:type="dxa" w:w="80"/>
+              <w:right w:type="dxa" w:w="110"/>
+            </w:tcMar>
+          </w:tcPr>
+          <w:p>
+            <w:pPr>
+              <w:spacing w:after="0" w:line="240"/>
+            </w:pPr>
+            <w:r>
+              <w:rPr>
+                <w:rFonts w:ascii="Calibri" w:cs="Calibri" w:eastAsia="Calibri" w:hAnsi="Calibri"/>
+                <w:b/>
+                <w:bCs/>
+                <w:color w:val="000000"/>
+                <w:sz w:val="20"/>
+                <w:szCs w:val="20"/>
+              </w:rPr>
+              <w:t xml:space="preserve">Component</w:t>
+            </w:r>
+          </w:p>
+        </w:tc>
+        <w:tc>
+          <w:tcPr>
+            <w:tcW w:type="dxa" w:w="4802"/>
+            <w:tcBorders>
+              <w:top w:val="single" w:color="000000" w:sz="2"/>
+              <w:left w:val="single" w:color="000000" w:sz="2"/>
+              <w:bottom w:val="single" w:color="000000" w:sz="2"/>
+              <w:right w:val="single" w:color="000000" w:sz="2"/>
+            </w:tcBorders>
+            <w:shd w:fill="E6E6E6" w:color="auto" w:val="clear"/>
+            <w:tcMar>
+              <w:top w:type="dxa" w:w="80"/>
+              <w:left w:type="dxa" w:w="110"/>
+              <w:bottom w:type="dxa" w:w="80"/>
+              <w:right w:type="dxa" w:w="110"/>
+            </w:tcMar>
+          </w:tcPr>
+          <w:p>
+            <w:pPr>
+              <w:spacing w:after="0" w:line="240"/>
+            </w:pPr>
+            <w:r>
+              <w:rPr>
+                <w:rFonts w:ascii="Calibri" w:cs="Calibri" w:eastAsia="Calibri" w:hAnsi="Calibri"/>
+                <w:b/>
+                <w:bCs/>
+                <w:color w:val="000000"/>
+                <w:sz w:val="20"/>
+                <w:szCs w:val="20"/>
+              </w:rPr>
+              <w:t xml:space="preserve">Specification</w:t>
+            </w:r>
+          </w:p>
+        </w:tc>
+      </w:tr>
+      <w:tr>
+        <w:tc>
+          <w:tcPr>
+            <w:tcW w:type="dxa" w:w="960"/>
+            <w:tcBorders>
+              <w:top w:val="single" w:color="000000" w:sz="2"/>
+              <w:left w:val="single" w:color="000000" w:sz="2"/>
+              <w:bottom w:val="single" w:color="000000" w:sz="2"/>
+              <w:right w:val="single" w:color="000000" w:sz="2"/>
+            </w:tcBorders>
+            <w:shd w:fill="FFFFFF" w:color="auto" w:val="clear"/>
+            <w:tcMar>
+              <w:top w:type="dxa" w:w="80"/>
+              <w:left w:type="dxa" w:w="110"/>
+              <w:bottom w:type="dxa" w:w="80"/>
+              <w:right w:type="dxa" w:w="110"/>
+            </w:tcMar>
+          </w:tcPr>
+          <w:p>
+            <w:pPr>
+              <w:spacing w:after="0" w:line="240"/>
+            </w:pPr>
+            <w:r>
+              <w:rPr>
+                <w:rFonts w:ascii="Calibri" w:cs="Calibri" w:eastAsia="Calibri" w:hAnsi="Calibri"/>
+                <w:color w:val="000000"/>
+                <w:sz w:val="20"/>
+                <w:szCs w:val="20"/>
+              </w:rPr>
+              <w:t xml:space="preserve">BB1-2</w:t>
+            </w:r>
+          </w:p>
+        </w:tc>
+        <w:tc>
+          <w:tcPr>
+            <w:tcW w:type="dxa" w:w="3842"/>
+            <w:tcBorders>
+              <w:top w:val="single" w:color="000000" w:sz="2"/>
+              <w:left w:val="single" w:color="000000" w:sz="2"/>
+              <w:bottom w:val="single" w:color="000000" w:sz="2"/>
+              <w:right w:val="single" w:color="000000" w:sz="2"/>
+            </w:tcBorders>
+            <w:shd w:fill="FFFFFF" w:color="auto" w:val="clear"/>
+            <w:tcMar>
+              <w:top w:type="dxa" w:w="80"/>
+              <w:left w:type="dxa" w:w="110"/>
+              <w:bottom w:type="dxa" w:w="80"/>
+              <w:right w:type="dxa" w:w="110"/>
+            </w:tcMar>
+          </w:tcPr>
+          <w:p>
+            <w:pPr>
+              <w:spacing w:after="0" w:line="240"/>
+            </w:pPr>
+            <w:r>
+              <w:rPr>
+                <w:rFonts w:ascii="Calibri" w:cs="Calibri" w:eastAsia="Calibri" w:hAnsi="Calibri"/>
+                <w:color w:val="000000"/>
+                <w:sz w:val="20"/>
+                <w:szCs w:val="20"/>
+              </w:rPr>
+              <w:t xml:space="preserve">Solderless breadboard, 2 off</w:t>
+            </w:r>
+          </w:p>
+        </w:tc>
+        <w:tc>
+          <w:tcPr>
+            <w:tcW w:type="dxa" w:w="4802"/>
+            <w:tcBorders>
+              <w:top w:val="single" w:color="000000" w:sz="2"/>
+              <w:left w:val="single" w:color="000000" w:sz="2"/>
+              <w:bottom w:val="single" w:color="000000" w:sz="2"/>
+              <w:right w:val="single" w:color="000000" w:sz="2"/>
+            </w:tcBorders>
+            <w:shd w:fill="FFFFFF" w:color="auto" w:val="clear"/>
+            <w:tcMar>
+              <w:top w:type="dxa" w:w="80"/>
+              <w:left w:type="dxa" w:w="110"/>
+              <w:bottom w:type="dxa" w:w="80"/>
+              <w:right w:type="dxa" w:w="110"/>
+            </w:tcMar>
+          </w:tcPr>
+          <w:p>
+            <w:pPr>
+              <w:spacing w:after="0" w:line="240"/>
+            </w:pPr>
+            <w:r>
+              <w:rPr>
+                <w:rFonts w:ascii="Calibri" w:cs="Calibri" w:eastAsia="Calibri" w:hAnsi="Calibri"/>
+                <w:color w:val="000000"/>
+                <w:sz w:val="20"/>
+                <w:szCs w:val="20"/>
+              </w:rPr>
+              <w:t xml:space="preserve">830 tie-points, full size</w:t>
+            </w:r>
+          </w:p>
+        </w:tc>
+      </w:tr>
+      <w:tr>
+        <w:tc>
+          <w:tcPr>
+            <w:tcW w:type="dxa" w:w="960"/>
+            <w:tcBorders>
+              <w:top w:val="single" w:color="000000" w:sz="2"/>
+              <w:left w:val="single" w:color="000000" w:sz="2"/>
+              <w:bottom w:val="single" w:color="000000" w:sz="2"/>
+              <w:right w:val="single" w:color="000000" w:sz="2"/>
+            </w:tcBorders>
+            <w:shd w:fill="FFFFFF" w:color="auto" w:val="clear"/>
+            <w:tcMar>
+              <w:top w:type="dxa" w:w="80"/>
+              <w:left w:type="dxa" w:w="110"/>
+              <w:bottom w:type="dxa" w:w="80"/>
+              <w:right w:type="dxa" w:w="110"/>
+            </w:tcMar>
+          </w:tcPr>
+          <w:p>
+            <w:pPr>
+              <w:spacing w:after="0" w:line="240"/>
+            </w:pPr>
+            <w:r>
+              <w:rPr>
+                <w:rFonts w:ascii="Calibri" w:cs="Calibri" w:eastAsia="Calibri" w:hAnsi="Calibri"/>
+                <w:color w:val="000000"/>
+                <w:sz w:val="20"/>
+                <w:szCs w:val="20"/>
+              </w:rPr>
+              <w:t xml:space="preserve">JW1</w:t>
+            </w:r>
+          </w:p>
+        </w:tc>
+        <w:tc>
+          <w:tcPr>
+            <w:tcW w:type="dxa" w:w="3842"/>
+            <w:tcBorders>
+              <w:top w:val="single" w:color="000000" w:sz="2"/>
+              <w:left w:val="single" w:color="000000" w:sz="2"/>
+              <w:bottom w:val="single" w:color="000000" w:sz="2"/>
+              <w:right w:val="single" w:color="000000" w:sz="2"/>
+            </w:tcBorders>
+            <w:shd w:fill="FFFFFF" w:color="auto" w:val="clear"/>
+            <w:tcMar>
+              <w:top w:type="dxa" w:w="80"/>
+              <w:left w:type="dxa" w:w="110"/>
+              <w:bottom w:type="dxa" w:w="80"/>
+              <w:right w:type="dxa" w:w="110"/>
+            </w:tcMar>
+          </w:tcPr>
+          <w:p>
+            <w:pPr>
+              <w:spacing w:after="0" w:line="240"/>
+            </w:pPr>
+            <w:r>
+              <w:rPr>
+                <w:rFonts w:ascii="Calibri" w:cs="Calibri" w:eastAsia="Calibri" w:hAnsi="Calibri"/>
+                <w:color w:val="000000"/>
+                <w:sz w:val="20"/>
+                <w:szCs w:val="20"/>
+              </w:rPr>
+              <w:t xml:space="preserve">Jumper wires, male to male</w:t>
+            </w:r>
+          </w:p>
+        </w:tc>
+        <w:tc>
+          <w:tcPr>
+            <w:tcW w:type="dxa" w:w="4802"/>
+            <w:tcBorders>
+              <w:top w:val="single" w:color="000000" w:sz="2"/>
+              <w:left w:val="single" w:color="000000" w:sz="2"/>
+              <w:bottom w:val="single" w:color="000000" w:sz="2"/>
+              <w:right w:val="single" w:color="000000" w:sz="2"/>
+            </w:tcBorders>
+            <w:shd w:fill="FFFFFF" w:color="auto" w:val="clear"/>
+            <w:tcMar>
+              <w:top w:type="dxa" w:w="80"/>
+              <w:left w:type="dxa" w:w="110"/>
+              <w:bottom w:type="dxa" w:w="80"/>
+              <w:right w:type="dxa" w:w="110"/>
+            </w:tcMar>
+          </w:tcPr>
+          <w:p>
+            <w:pPr>
+              <w:spacing w:after="0" w:line="240"/>
+            </w:pPr>
+            <w:r>
+              <w:rPr>
+                <w:rFonts w:ascii="Calibri" w:cs="Calibri" w:eastAsia="Calibri" w:hAnsi="Calibri"/>
+                <w:color w:val="000000"/>
+                <w:sz w:val="20"/>
+                <w:szCs w:val="20"/>
+              </w:rPr>
+              <w:t xml:space="preserve">20 cm, 40-way ribbon</w:t>
+            </w:r>
+          </w:p>
+        </w:tc>
+      </w:tr>
+      <w:tr>
+        <w:tc>
+          <w:tcPr>
+            <w:tcW w:type="dxa" w:w="960"/>
+            <w:tcBorders>
+              <w:top w:val="single" w:color="000000" w:sz="2"/>
+              <w:left w:val="single" w:color="000000" w:sz="2"/>
+              <w:bottom w:val="single" w:color="000000" w:sz="2"/>
+              <w:right w:val="single" w:color="000000" w:sz="2"/>
+            </w:tcBorders>
+            <w:shd w:fill="FFFFFF" w:color="auto" w:val="clear"/>
+            <w:tcMar>
+              <w:top w:type="dxa" w:w="80"/>
+              <w:left w:type="dxa" w:w="110"/>
+              <w:bottom w:type="dxa" w:w="80"/>
+              <w:right w:type="dxa" w:w="110"/>
+            </w:tcMar>
+          </w:tcPr>
+          <w:p>
+            <w:pPr>
+              <w:spacing w:after="0" w:line="240"/>
+            </w:pPr>
+            <w:r>
+              <w:rPr>
+                <w:rFonts w:ascii="Calibri" w:cs="Calibri" w:eastAsia="Calibri" w:hAnsi="Calibri"/>
+                <w:color w:val="000000"/>
+                <w:sz w:val="20"/>
+                <w:szCs w:val="20"/>
+              </w:rPr>
+              <w:t xml:space="preserve">JW2</w:t>
+            </w:r>
+          </w:p>
+        </w:tc>
+        <w:tc>
+          <w:tcPr>
+            <w:tcW w:type="dxa" w:w="3842"/>
+            <w:tcBorders>
+              <w:top w:val="single" w:color="000000" w:sz="2"/>
+              <w:left w:val="single" w:color="000000" w:sz="2"/>
+              <w:bottom w:val="single" w:color="000000" w:sz="2"/>
+              <w:right w:val="single" w:color="000000" w:sz="2"/>
+            </w:tcBorders>
+            <w:shd w:fill="FFFFFF" w:color="auto" w:val="clear"/>
+            <w:tcMar>
+              <w:top w:type="dxa" w:w="80"/>
+              <w:left w:type="dxa" w:w="110"/>
+              <w:bottom w:type="dxa" w:w="80"/>
+              <w:right w:type="dxa" w:w="110"/>
+            </w:tcMar>
+          </w:tcPr>
+          <w:p>
+            <w:pPr>
+              <w:spacing w:after="0" w:line="240"/>
+            </w:pPr>
+            <w:r>
+              <w:rPr>
+                <w:rFonts w:ascii="Calibri" w:cs="Calibri" w:eastAsia="Calibri" w:hAnsi="Calibri"/>
+                <w:color w:val="000000"/>
+                <w:sz w:val="20"/>
+                <w:szCs w:val="20"/>
+              </w:rPr>
+              <w:t xml:space="preserve">Jumper wires, male to female</w:t>
+            </w:r>
+          </w:p>
+        </w:tc>
+        <w:tc>
+          <w:tcPr>
+            <w:tcW w:type="dxa" w:w="4802"/>
+            <w:tcBorders>
+              <w:top w:val="single" w:color="000000" w:sz="2"/>
+              <w:left w:val="single" w:color="000000" w:sz="2"/>
+              <w:bottom w:val="single" w:color="000000" w:sz="2"/>
+              <w:right w:val="single" w:color="000000" w:sz="2"/>
+            </w:tcBorders>
+            <w:shd w:fill="FFFFFF" w:color="auto" w:val="clear"/>
+            <w:tcMar>
+              <w:top w:type="dxa" w:w="80"/>
+              <w:left w:type="dxa" w:w="110"/>
+              <w:bottom w:type="dxa" w:w="80"/>
+              <w:right w:type="dxa" w:w="110"/>
+            </w:tcMar>
+          </w:tcPr>
+          <w:p>
+            <w:pPr>
+              <w:spacing w:after="0" w:line="240"/>
+            </w:pPr>
+            <w:r>
+              <w:rPr>
+                <w:rFonts w:ascii="Calibri" w:cs="Calibri" w:eastAsia="Calibri" w:hAnsi="Calibri"/>
+                <w:color w:val="000000"/>
+                <w:sz w:val="20"/>
+                <w:szCs w:val="20"/>
+              </w:rPr>
+              <w:t xml:space="preserve">20 cm, 40-way ribbon</w:t>
+            </w:r>
+          </w:p>
+        </w:tc>
+      </w:tr>
+      <w:tr>
+        <w:tc>
+          <w:tcPr>
+            <w:tcW w:type="dxa" w:w="960"/>
+            <w:tcBorders>
+              <w:top w:val="single" w:color="000000" w:sz="2"/>
+              <w:left w:val="single" w:color="000000" w:sz="2"/>
+              <w:bottom w:val="single" w:color="000000" w:sz="2"/>
+              <w:right w:val="single" w:color="000000" w:sz="2"/>
+            </w:tcBorders>
+            <w:shd w:fill="FFFFFF" w:color="auto" w:val="clear"/>
+            <w:tcMar>
+              <w:top w:type="dxa" w:w="80"/>
+              <w:left w:type="dxa" w:w="110"/>
+              <w:bottom w:type="dxa" w:w="80"/>
+              <w:right w:type="dxa" w:w="110"/>
+            </w:tcMar>
+          </w:tcPr>
+          <w:p>
+            <w:pPr>
+              <w:spacing w:after="0" w:line="240"/>
+            </w:pPr>
+            <w:r>
+              <w:rPr>
+                <w:rFonts w:ascii="Calibri" w:cs="Calibri" w:eastAsia="Calibri" w:hAnsi="Calibri"/>
+                <w:color w:val="000000"/>
+                <w:sz w:val="20"/>
+                <w:szCs w:val="20"/>
+              </w:rPr>
+              <w:t xml:space="preserve">JW3</w:t>
+            </w:r>
+          </w:p>
+        </w:tc>
+        <w:tc>
+          <w:tcPr>
+            <w:tcW w:type="dxa" w:w="3842"/>
+            <w:tcBorders>
+              <w:top w:val="single" w:color="000000" w:sz="2"/>
+              <w:left w:val="single" w:color="000000" w:sz="2"/>
+              <w:bottom w:val="single" w:color="000000" w:sz="2"/>
+              <w:right w:val="single" w:color="000000" w:sz="2"/>
+            </w:tcBorders>
+            <w:shd w:fill="FFFFFF" w:color="auto" w:val="clear"/>
+            <w:tcMar>
+              <w:top w:type="dxa" w:w="80"/>
+              <w:left w:type="dxa" w:w="110"/>
+              <w:bottom w:type="dxa" w:w="80"/>
+              <w:right w:type="dxa" w:w="110"/>
+            </w:tcMar>
+          </w:tcPr>
+          <w:p>
+            <w:pPr>
+              <w:spacing w:after="0" w:line="240"/>
+            </w:pPr>
+            <w:r>
+              <w:rPr>
+                <w:rFonts w:ascii="Calibri" w:cs="Calibri" w:eastAsia="Calibri" w:hAnsi="Calibri"/>
+                <w:color w:val="000000"/>
+                <w:sz w:val="20"/>
+                <w:szCs w:val="20"/>
+              </w:rPr>
+              <w:t xml:space="preserve">Jumper wires, female to female</w:t>
+            </w:r>
+          </w:p>
+        </w:tc>
+        <w:tc>
+          <w:tcPr>
+            <w:tcW w:type="dxa" w:w="4802"/>
+            <w:tcBorders>
+              <w:top w:val="single" w:color="000000" w:sz="2"/>
+              <w:left w:val="single" w:color="000000" w:sz="2"/>
+              <w:bottom w:val="single" w:color="000000" w:sz="2"/>
+              <w:right w:val="single" w:color="000000" w:sz="2"/>
+            </w:tcBorders>
+            <w:shd w:fill="FFFFFF" w:color="auto" w:val="clear"/>
+            <w:tcMar>
+              <w:top w:type="dxa" w:w="80"/>
+              <w:left w:type="dxa" w:w="110"/>
+              <w:bottom w:type="dxa" w:w="80"/>
+              <w:right w:type="dxa" w:w="110"/>
+            </w:tcMar>
+          </w:tcPr>
+          <w:p>
+            <w:pPr>
+              <w:spacing w:after="0" w:line="240"/>
+            </w:pPr>
+            <w:r>
+              <w:rPr>
+                <w:rFonts w:ascii="Calibri" w:cs="Calibri" w:eastAsia="Calibri" w:hAnsi="Calibri"/>
+                <w:color w:val="000000"/>
+                <w:sz w:val="20"/>
+                <w:szCs w:val="20"/>
+              </w:rPr>
+              <w:t xml:space="preserve">20 cm, 40-way ribbon</w:t>
+            </w:r>
+          </w:p>
+        </w:tc>
+      </w:tr>
+      <w:tr>
+        <w:tc>
+          <w:tcPr>
+            <w:tcW w:type="dxa" w:w="960"/>
+            <w:tcBorders>
+              <w:top w:val="single" w:color="000000" w:sz="2"/>
+              <w:left w:val="single" w:color="000000" w:sz="2"/>
+              <w:bottom w:val="single" w:color="000000" w:sz="2"/>
+              <w:right w:val="single" w:color="000000" w:sz="2"/>
+            </w:tcBorders>
+            <w:shd w:fill="FFFFFF" w:color="auto" w:val="clear"/>
+            <w:tcMar>
+              <w:top w:type="dxa" w:w="80"/>
+              <w:left w:type="dxa" w:w="110"/>
+              <w:bottom w:type="dxa" w:w="80"/>
+              <w:right w:type="dxa" w:w="110"/>
+            </w:tcMar>
+          </w:tcPr>
+          <w:p>
+            <w:pPr>
+              <w:spacing w:after="0" w:line="240"/>
+            </w:pPr>
+            <w:r>
+              <w:rPr>
+                <w:rFonts w:ascii="Calibri" w:cs="Calibri" w:eastAsia="Calibri" w:hAnsi="Calibri"/>
+                <w:color w:val="000000"/>
+                <w:sz w:val="20"/>
+                <w:szCs w:val="20"/>
+              </w:rPr>
+              <w:t xml:space="preserve">IC1</w:t>
+            </w:r>
+          </w:p>
+        </w:tc>
+        <w:tc>
+          <w:tcPr>
+            <w:tcW w:type="dxa" w:w="3842"/>
+            <w:tcBorders>
+              <w:top w:val="single" w:color="000000" w:sz="2"/>
+              <w:left w:val="single" w:color="000000" w:sz="2"/>
+              <w:bottom w:val="single" w:color="000000" w:sz="2"/>
+              <w:right w:val="single" w:color="000000" w:sz="2"/>
+            </w:tcBorders>
+            <w:shd w:fill="FFFFFF" w:color="auto" w:val="clear"/>
+            <w:tcMar>
+              <w:top w:type="dxa" w:w="80"/>
+              <w:left w:type="dxa" w:w="110"/>
+              <w:bottom w:type="dxa" w:w="80"/>
+              <w:right w:type="dxa" w:w="110"/>
+            </w:tcMar>
+          </w:tcPr>
+          <w:p>
+            <w:pPr>
+              <w:spacing w:after="0" w:line="240"/>
+            </w:pPr>
+            <w:r>
+              <w:rPr>
+                <w:rFonts w:ascii="Calibri" w:cs="Calibri" w:eastAsia="Calibri" w:hAnsi="Calibri"/>
+                <w:color w:val="000000"/>
+                <w:sz w:val="20"/>
+                <w:szCs w:val="20"/>
+              </w:rPr>
+              <w:t xml:space="preserve">IC sockets, DIP</w:t>
+            </w:r>
+          </w:p>
+        </w:tc>
+        <w:tc>
+          <w:tcPr>
+            <w:tcW w:type="dxa" w:w="4802"/>
+            <w:tcBorders>
+              <w:top w:val="single" w:color="000000" w:sz="2"/>
+              <w:left w:val="single" w:color="000000" w:sz="2"/>
+              <w:bottom w:val="single" w:color="000000" w:sz="2"/>
+              <w:right w:val="single" w:color="000000" w:sz="2"/>
+            </w:tcBorders>
+            <w:shd w:fill="FFFFFF" w:color="auto" w:val="clear"/>
+            <w:tcMar>
+              <w:top w:type="dxa" w:w="80"/>
+              <w:left w:type="dxa" w:w="110"/>
+              <w:bottom w:type="dxa" w:w="80"/>
+              <w:right w:type="dxa" w:w="110"/>
+            </w:tcMar>
+          </w:tcPr>
+          <w:p>
+            <w:pPr>
+              <w:spacing w:after="0" w:line="240"/>
+            </w:pPr>
+            <w:r>
+              <w:rPr>
+                <w:rFonts w:ascii="Calibri" w:cs="Calibri" w:eastAsia="Calibri" w:hAnsi="Calibri"/>
+                <w:color w:val="000000"/>
+                <w:sz w:val="20"/>
+                <w:szCs w:val="20"/>
+              </w:rPr>
+              <w:t xml:space="preserve">8-pin, 16-pin and 28-pin, assorted</w:t>
             </w:r>
           </w:p>
         </w:tc>

</xml_diff>

<commit_message>
Swap DIP IC sockets for female header strips, and quantify the jumper wires
Neither BOM contains a DIP IC — every active part is a pre-built module,
surface-mount (AMS1117 SOT-223, MT3608 SOT-23-6), a cable probe, or a
discrete through-hole passive. DIP sockets had nothing to seat.

Female header strips serve the intended purpose: modules plug in rather
than being soldered down, so a dead ESP32 is a swap instead of
desoldering 38 pins. 64 pins for CN-01, 51 for BS-01 — 8 x 40-way strips
covers two collars and one base station.

Jumper quantities derived from the netlists: 28 connections on CN-01, 18
on BS-01, mostly module-pin to breadboard, hence the male-to-female bias.

Co-Authored-By: Claude <noreply@anthropic.com>
</commit_message>
<xml_diff>
--- a/PFUMA_Component_List.docx
+++ b/PFUMA_Component_List.docx
@@ -4032,7 +4032,7 @@
                 <w:sz w:val="20"/>
                 <w:szCs w:val="20"/>
               </w:rPr>
-              <w:t xml:space="preserve">Jumper wires, male to male</w:t>
+              <w:t xml:space="preserve">Jumper wires, male to female, 2 sets</w:t>
             </w:r>
           </w:p>
         </w:tc>
@@ -4130,7 +4130,7 @@
                 <w:sz w:val="20"/>
                 <w:szCs w:val="20"/>
               </w:rPr>
-              <w:t xml:space="preserve">Jumper wires, male to female</w:t>
+              <w:t xml:space="preserve">Jumper wires, male to male, 1 set</w:t>
             </w:r>
           </w:p>
         </w:tc>
@@ -4228,7 +4228,7 @@
                 <w:sz w:val="20"/>
                 <w:szCs w:val="20"/>
               </w:rPr>
-              <w:t xml:space="preserve">Jumper wires, female to female</w:t>
+              <w:t xml:space="preserve">Jumper wires, female to female, 1 set</w:t>
             </w:r>
           </w:p>
         </w:tc>
@@ -4294,7 +4294,7 @@
                 <w:sz w:val="20"/>
                 <w:szCs w:val="20"/>
               </w:rPr>
-              <w:t xml:space="preserve">IC1</w:t>
+              <w:t xml:space="preserve">HDR1</w:t>
             </w:r>
           </w:p>
         </w:tc>
@@ -4326,7 +4326,7 @@
                 <w:sz w:val="20"/>
                 <w:szCs w:val="20"/>
               </w:rPr>
-              <w:t xml:space="preserve">IC sockets, DIP</w:t>
+              <w:t xml:space="preserve">Female header strips, 8 off</w:t>
             </w:r>
           </w:p>
         </w:tc>
@@ -4358,7 +4358,7 @@
                 <w:sz w:val="20"/>
                 <w:szCs w:val="20"/>
               </w:rPr>
-              <w:t xml:space="preserve">8-pin, 16-pin and 28-pin, assorted</w:t>
+              <w:t xml:space="preserve">2.54 mm pitch, 40-way, snappable</w:t>
             </w:r>
           </w:p>
         </w:tc>

</xml_diff>